<commit_message>
Publish Thai Word documentation v1.2 with login walkthrough
</commit_message>
<xml_diff>
--- a/docs/deliverables/01-LifeLab-User-and-Source-Manual.docx
+++ b/docs/deliverables/01-LifeLab-User-and-Source-Manual.docx
@@ -26,7 +26,7 @@
           <w:szCs w:val="22"/>
           <w:lang w:val="th-TH" w:eastAsia="th-TH"/>
         </w:rPr>
-        <w:t>ฉบับ 1.1  วันที่ 28 กันยายน 2569  ฟอนต์ Noto Sans Thai</w:t>
+        <w:t>ฉบับ 1.2  วันที่ 29 กันยายน 2569  ฟอนต์ Noto Sans Thai</w:t>
       </w:r>
     </w:p>
     <w:p>
@@ -67,7 +67,7 @@
           <w:szCs w:val="22"/>
           <w:lang w:val="th-TH" w:eastAsia="th-TH"/>
         </w:rPr>
-        <w:t>1. เปิดลิงก์เดโมที่ผู้ดูแลส่งให้ เลือกมุมมองผู้บริหารในแถบ DEMO เพื่อดูทุกโมดูล ไม่ต้องใช้ Password</w:t>
+        <w:t>1. เปิดลิงก์เดโม กรอก Username user05 และ Password 12345 จะเข้า Dashboard ด้วยสิทธิ์ผู้บริหาร เข้าถึงทุกโมดูลและฟังก์ชันตามเงื่อนไขธุรกิจ</w:t>
       </w:r>
     </w:p>
     <w:p>
@@ -101,6 +101,17 @@
           <w:lang w:val="th-TH" w:eastAsia="th-TH"/>
         </w:rPr>
         <w:t>4. เมื่อต้องการเริ่มข้อมูลใหม่ เปิดตั้งค่าและนำเข้าข้อมูล แล้วส่งออก JSON สำรองก่อนกดยืนยันคืนค่าข้อมูลตัวอย่าง การล้างข้อมูลกระทบ browser นี้เท่านั้น</w:t>
+      </w:r>
+    </w:p>
+    <w:p>
+      <w:r>
+        <w:rPr>
+          <w:rFonts w:ascii="Noto Sans Thai" w:hAnsi="Noto Sans Thai" w:eastAsia="Noto Sans Thai" w:cs="Noto Sans Thai"/>
+          <w:color w:val="000000"/>
+          <w:szCs w:val="22"/>
+          <w:lang w:val="th-TH" w:eastAsia="th-TH"/>
+        </w:rPr>
+        <w:t>Login แสดงก่อนเข้าโมดูลแม้เปิดลิงก์ #learning มีปุ่มแสดงหรือซ่อนรหัสและแจ้งเมื่อกรอกผิด Refresh แท็บเดิมยังอยู่ในระบบ กดออกจากระบบกลับ Login โดยไม่ล้างข้อมูล CRM ใช้ sessionStorage เพื่อสาธิต ไม่ใช่ server Authentication</w:t>
       </w:r>
     </w:p>
     <w:p>
@@ -1898,7 +1909,7 @@
         <w:szCs w:val="18"/>
         <w:lang w:val="th-TH" w:eastAsia="th-TH"/>
       </w:rPr>
-      <w:t xml:space="preserve">LifeLab CRM  •  ฉบับ 1.1  •  หน้า </w:t>
+      <w:t xml:space="preserve">LifeLab CRM  •  ฉบับ 1.2  •  หน้า </w:t>
     </w:r>
     <w:fldSimple w:instr="PAGE"/>
   </w:p>

</xml_diff>